<commit_message>
Update aura project changes
</commit_message>
<xml_diff>
--- a/Aura_Project_Progress.docx
+++ b/Aura_Project_Progress.docx
@@ -421,6 +421,104 @@
         <w:t>The user provided a screenshot demonstrating that the first Bento grid card still looked entirely different from the other two—it retained a green background tint, its icon was larger and emerald-colored, and the CSS hover effect was broken. I realized the HTML still contained the 'big' class and custom inline SVG attributes. I stripped the 'big' class from the HTML and normalized the SVG stroke to 'currentColor' so that all three cards share the exact same base styling and responsive hover states.</w:t>
       </w:r>
     </w:p>
+    <w:p>
+      <w:pPr>
+        <w:pStyle w:val="ListBullet"/>
+      </w:pPr>
+      <w:r>
+        <w:rPr>
+          <w:b/>
+        </w:rPr>
+        <w:t xml:space="preserve">[2026-06-13 14:30] </w:t>
+      </w:r>
+      <w:r>
+        <w:t>Implemented the Drag &amp; Drop Morphing interaction (Item 1 from the audit). I separated the standard hover state from the active dragover state. Now, simply hovering scales the box up slightly with a green glow. When a file is physically dragged over it, the scale increases further, the glow intensifies, and a custom CSS keyframe animation (@keyframes liquidMorph) smoothly warps the border-radius corners dynamically, making the UI element react like a living, breathing pool of liquid.</w:t>
+      </w:r>
+    </w:p>
+    <w:p>
+      <w:pPr>
+        <w:pStyle w:val="ListBullet"/>
+      </w:pPr>
+      <w:r>
+        <w:rPr>
+          <w:b/>
+        </w:rPr>
+        <w:t xml:space="preserve">[2026-06-13 14:42] </w:t>
+      </w:r>
+      <w:r>
+        <w:t>Implemented Item 2: Image Sliders UX update. Redesigned both the main upload result slider and the community gallery sliders to be much more prominent on mobile. Increased the grabber sizes to 50px, styled them with high-contrast white borders and SVG chevrons, and added an infinite vertical CSS line using a pseudo-element trick so the boundary between the 'Before' and 'After' images is completely unmistakable.</w:t>
+      </w:r>
+    </w:p>
+    <w:p>
+      <w:pPr>
+        <w:pStyle w:val="ListBullet"/>
+      </w:pPr>
+      <w:r>
+        <w:rPr>
+          <w:b/>
+        </w:rPr>
+        <w:t xml:space="preserve">[2026-06-13 14:46] </w:t>
+      </w:r>
+      <w:r>
+        <w:t>Fixed a bug where attempting to drag the slider handles would sometimes accidentally trigger the browser's native 'ghost image' drag behavior on the underlying image instead. Added -webkit-user-drag: none; user-select: none; pointer-events: none; to all slider images inside style.css.</w:t>
+      </w:r>
+    </w:p>
+    <w:p>
+      <w:pPr>
+        <w:pStyle w:val="ListBullet"/>
+      </w:pPr>
+      <w:r>
+        <w:rPr>
+          <w:b/>
+        </w:rPr>
+        <w:t xml:space="preserve">[2026-06-13 14:48] </w:t>
+      </w:r>
+      <w:r>
+        <w:t>Implemented Items 3 and 4 from the UI/UX audit. Redesigned the 'Style Selector' active state to have a premium emerald background glow and high-contrast border, matching the Aura brand while upgrading the inactive states to an elegant glassmorphic feel. Also dropped the opacity of the 'Trusted By 500+' marquee text (color: rgba(255,255,255,0.4)) so the social proof feels more subtle and doesn't visually compete with the vibrant imagery.</w:t>
+      </w:r>
+    </w:p>
+    <w:p>
+      <w:pPr>
+        <w:pStyle w:val="ListBullet"/>
+      </w:pPr>
+      <w:r>
+        <w:rPr>
+          <w:b/>
+        </w:rPr>
+        <w:t xml:space="preserve">[2026-06-13 15:07] </w:t>
+      </w:r>
+      <w:r>
+        <w:t>Implemented Item 5: Testimonials UI Update. Generated 4 unique, highly realistic 4K headshots matching the exact personas of the testimonials (Sarah the Architect, Marcus the Interior Designer, Elena the Founder, David the 3D Artist). Modified the HTML structure inside the Marquee to replace the colorful placeholder initials with actual &lt;img&gt; tags pointing to these new premium headshots, giving the social proof section a huge boost in credibility and aesthetic quality.</w:t>
+      </w:r>
+    </w:p>
+    <w:p>
+      <w:pPr>
+        <w:pStyle w:val="ListBullet"/>
+      </w:pPr>
+      <w:r>
+        <w:rPr>
+          <w:b/>
+        </w:rPr>
+        <w:t xml:space="preserve">[2026-06-13 15:09] </w:t>
+      </w:r>
+      <w:r>
+        <w:t>Technical Audit: Converted the top navigation bar from 'position: fixed' to 'position: sticky' to improve document flow. Enhanced the glassmorphism aesthetic by increasing the backdrop-blur to 16px, adding the webkit prefix for iOS support, slightly darkening the background opacity, and introducing a subtle 1px white border at the bottom. This ensures the brand and navigation remain highly readable while floating beautifully over the dark UI.</w:t>
+      </w:r>
+    </w:p>
+    <w:p>
+      <w:pPr>
+        <w:pStyle w:val="ListBullet"/>
+      </w:pPr>
+      <w:r>
+        <w:rPr>
+          <w:b/>
+        </w:rPr>
+        <w:t xml:space="preserve">[2026-06-13 15:35] </w:t>
+      </w:r>
+      <w:r>
+        <w:t>Implemented the final technical audit items. Mass-updated all image tags to enforce native browser lazy loading, while applying 'fetchpriority=high' to the Hero LCP image. Resolved the 'snapping' state transition bug on the Style Selector by injecting &lt;link rel='preload'&gt; tags into the document &lt;head&gt; for the style variants, ensuring the CSS crossfade transition works flawlessly without waiting for network download times.</w:t>
+      </w:r>
+    </w:p>
     <w:sectPr>
       <w:pgSz w:w="12240" w:h="15840"/>
       <w:pgMar w:top="1440" w:right="1800" w:bottom="1440" w:left="1800" w:header="720" w:footer="720" w:gutter="0"/>

</xml_diff>